<commit_message>
Full rebuild (with Artscroll sources)
</commit_message>
<xml_diff>
--- a/Files/01 - Bereshis/07 - Vayaitzei/5784/Vayaitzei 5784.docx
+++ b/Files/01 - Bereshis/07 - Vayaitzei/5784/Vayaitzei 5784.docx
@@ -84,7 +84,7 @@
           <w:rFonts w:ascii="Times New Roman" w:hAnsi="Times New Roman" w:cs="Times New Roman"/>
           <w:rtl/>
         </w:rPr>
-        <w:t>רש"י</w:t>
+        <w:t>רש״י</w:t>
       </w:r>
       <w:r>
         <w:rPr>
@@ -1208,7 +1208,7 @@
         <w:rPr>
           <w:rFonts w:ascii="Times New Roman" w:hAnsi="Times New Roman" w:cs="Times New Roman"/>
         </w:rPr>
-        <w:t xml:space="preserve"> consistently acted</w:t>
+        <w:t xml:space="preserve"> consistently acted </w:t>
       </w:r>
       <w:r>
         <w:rPr>

</xml_diff>